<commit_message>
Atualizar relatório técnico após publicação do MVP
</commit_message>
<xml_diff>
--- a/docs/Relatorio_Tecnico_HospIntel_SP.docx
+++ b/docs/Relatorio_Tecnico_HospIntel_SP.docx
@@ -158,7 +158,7 @@
           </w:tcPr>
           <w:p>
             <w:r>
-              <w:t>MVP funcional, integrado e validado</w:t>
+              <w:t>MVP funcional, publicado, integrado e validado</w:t>
             </w:r>
           </w:p>
         </w:tc>
@@ -745,6 +745,124 @@
           </w:p>
         </w:tc>
       </w:tr>
+      <w:tr>
+        <w:tc>
+          <w:tcPr>
+            <w:tcW w:type="dxa" w:w="2200"/>
+            <w:shd w:fill="F8FAFC"/>
+            <w:tcMar>
+              <w:top w:w="100" w:type="dxa"/>
+              <w:start w:w="120" w:type="dxa"/>
+              <w:bottom w:w="100" w:type="dxa"/>
+              <w:end w:w="120" w:type="dxa"/>
+            </w:tcMar>
+          </w:tcPr>
+          <w:p>
+            <w:pPr/>
+            <w:r>
+              <w:rPr/>
+              <w:t>Versionamento</w:t>
+            </w:r>
+          </w:p>
+        </w:tc>
+        <w:tc>
+          <w:tcPr>
+            <w:tcW w:type="dxa" w:w="2300"/>
+            <w:shd w:fill="F8FAFC"/>
+            <w:tcMar>
+              <w:top w:w="100" w:type="dxa"/>
+              <w:start w:w="120" w:type="dxa"/>
+              <w:bottom w:w="100" w:type="dxa"/>
+              <w:end w:w="120" w:type="dxa"/>
+            </w:tcMar>
+          </w:tcPr>
+          <w:p>
+            <w:pPr/>
+            <w:r>
+              <w:rPr/>
+              <w:t>Git e GitHub</w:t>
+            </w:r>
+          </w:p>
+        </w:tc>
+        <w:tc>
+          <w:tcPr>
+            <w:tcW w:type="dxa" w:w="4860"/>
+            <w:shd w:fill="F8FAFC"/>
+            <w:tcMar>
+              <w:top w:w="100" w:type="dxa"/>
+              <w:start w:w="120" w:type="dxa"/>
+              <w:bottom w:w="100" w:type="dxa"/>
+              <w:end w:w="120" w:type="dxa"/>
+            </w:tcMar>
+          </w:tcPr>
+          <w:p>
+            <w:pPr/>
+            <w:r>
+              <w:rPr/>
+              <w:t>Repositório privado, branch de implantação, pull request revisada e integração à main.</w:t>
+            </w:r>
+          </w:p>
+        </w:tc>
+      </w:tr>
+      <w:tr>
+        <w:tc>
+          <w:tcPr>
+            <w:tcW w:type="dxa" w:w="2200"/>
+            <w:shd w:fill="F8FAFC"/>
+            <w:tcMar>
+              <w:top w:w="100" w:type="dxa"/>
+              <w:start w:w="120" w:type="dxa"/>
+              <w:bottom w:w="100" w:type="dxa"/>
+              <w:end w:w="120" w:type="dxa"/>
+            </w:tcMar>
+          </w:tcPr>
+          <w:p>
+            <w:pPr/>
+            <w:r>
+              <w:rPr/>
+              <w:t>Hospedagem</w:t>
+            </w:r>
+          </w:p>
+        </w:tc>
+        <w:tc>
+          <w:tcPr>
+            <w:tcW w:type="dxa" w:w="2300"/>
+            <w:shd w:fill="F8FAFC"/>
+            <w:tcMar>
+              <w:top w:w="100" w:type="dxa"/>
+              <w:start w:w="120" w:type="dxa"/>
+              <w:bottom w:w="100" w:type="dxa"/>
+              <w:end w:w="120" w:type="dxa"/>
+            </w:tcMar>
+          </w:tcPr>
+          <w:p>
+            <w:pPr/>
+            <w:r>
+              <w:rPr/>
+              <w:t>Streamlit Community Cloud</w:t>
+            </w:r>
+          </w:p>
+        </w:tc>
+        <w:tc>
+          <w:tcPr>
+            <w:tcW w:type="dxa" w:w="4860"/>
+            <w:shd w:fill="F8FAFC"/>
+            <w:tcMar>
+              <w:top w:w="100" w:type="dxa"/>
+              <w:start w:w="120" w:type="dxa"/>
+              <w:bottom w:w="100" w:type="dxa"/>
+              <w:end w:w="120" w:type="dxa"/>
+            </w:tcMar>
+          </w:tcPr>
+          <w:p>
+            <w:pPr/>
+            <w:r>
+              <w:rPr/>
+              <w:t>Publicação HTTPS do aplicativo e execução do app.py a partir do GitHub.</w:t>
+            </w:r>
+          </w:p>
+        </w:tc>
+      </w:tr>
     </w:tbl>
     <w:p>
       <w:pPr>
@@ -816,7 +934,7 @@
     </w:p>
     <w:p>
       <w:r>
-        <w:t>O Streamlit recebeu dois modos: demonstração local e Oracle Select AI. No modo conectado, o SQL gerado é validado antes da execução e fica visível para auditoria.</w:t>
+        <w:t>O Streamlit recebeu dois modos: demonstração local e Oracle Select AI. No modo conectado, o SQL gerado é validado antes da execução e fica visível para auditoria. A aplicação também foi publicada no Streamlit Community Cloud a partir do repositório privado do projeto no GitHub.</w:t>
       </w:r>
     </w:p>
     <w:p>
@@ -830,6 +948,20 @@
     <w:p>
       <w:r>
         <w:t>Foram testados totais, rankings, filtros por município e mês, maior valor mensal, crescimento absoluto, redução absoluta e crescimento percentual.</w:t>
+      </w:r>
+    </w:p>
+    <w:p>
+      <w:pPr>
+        <w:pStyle w:val="Heading2"/>
+      </w:pPr>
+      <w:r>
+        <w:t>3.7 Versionamento e publicação</w:t>
+      </w:r>
+    </w:p>
+    <w:p>
+      <w:pPr/>
+      <w:r>
+        <w:t>O código foi versionado em um repositório privado no GitHub. As adaptações de implantação foram desenvolvidas na branch deploy-streamlit, validadas localmente, submetidas à pull request nº 1 e integradas à branch main. No Streamlit Community Cloud, a wallet Oracle é fornecida como segredo em Base64 e reconstruída somente em diretório temporário protegido durante a execução.</w:t>
       </w:r>
     </w:p>
     <w:p>
@@ -874,6 +1006,18 @@
       </w:pPr>
       <w:r>
         <w:t>SQL gerado → validador de somente leitura → views autorizadas → resultado e SQL exibidos</w:t>
+      </w:r>
+    </w:p>
+    <w:p>
+      <w:pPr/>
+      <w:r>
+        <w:t>GitHub (main) → Streamlit Community Cloud → aplicação HTTPS HospIntel SP</w:t>
+      </w:r>
+    </w:p>
+    <w:p>
+      <w:pPr/>
+      <w:r>
+        <w:t>Secrets do Streamlit → wallet Base64 → diretório temporário → conexão TCPS com Oracle</w:t>
       </w:r>
     </w:p>
     <w:p>
@@ -936,6 +1080,22 @@
       </w:pPr>
       <w:r>
         <w:t>A função de integração gera SQL, mas não concede à aplicação acesso direto à credencial do provedor de IA.</w:t>
+      </w:r>
+    </w:p>
+    <w:p>
+      <w:pPr>
+        <w:pStyle w:val="ListBullet"/>
+      </w:pPr>
+      <w:r>
+        <w:t>No ambiente hospedado, senhas e wallet são armazenadas nos Secrets do Streamlit e não no GitHub.</w:t>
+      </w:r>
+    </w:p>
+    <w:p>
+      <w:pPr>
+        <w:pStyle w:val="ListBullet"/>
+      </w:pPr>
+      <w:r>
+        <w:t>A wallet em Base64 é extraída com validação de caminhos e permissões restritas aos arquivos temporários.</w:t>
       </w:r>
     </w:p>
     <w:p>
@@ -1281,6 +1441,158 @@
           </w:p>
         </w:tc>
       </w:tr>
+      <w:tr>
+        <w:tc>
+          <w:tcPr>
+            <w:tcW w:type="dxa" w:w="6000"/>
+            <w:tcMar>
+              <w:top w:w="100" w:type="dxa"/>
+              <w:start w:w="120" w:type="dxa"/>
+              <w:bottom w:w="100" w:type="dxa"/>
+              <w:end w:w="120" w:type="dxa"/>
+            </w:tcMar>
+          </w:tcPr>
+          <w:p>
+            <w:pPr/>
+            <w:r>
+              <w:rPr/>
+              <w:t>Conexão Oracle pelo usuário HOSPINTELAPP</w:t>
+            </w:r>
+          </w:p>
+        </w:tc>
+        <w:tc>
+          <w:tcPr>
+            <w:tcW w:type="dxa" w:w="3360"/>
+            <w:tcMar>
+              <w:top w:w="100" w:type="dxa"/>
+              <w:start w:w="120" w:type="dxa"/>
+              <w:bottom w:w="100" w:type="dxa"/>
+              <w:end w:w="120" w:type="dxa"/>
+            </w:tcMar>
+          </w:tcPr>
+          <w:p>
+            <w:pPr/>
+            <w:r>
+              <w:rPr/>
+              <w:t>Aprovada — 3.924 linhas consultadas</w:t>
+            </w:r>
+          </w:p>
+        </w:tc>
+      </w:tr>
+      <w:tr>
+        <w:tc>
+          <w:tcPr>
+            <w:tcW w:type="dxa" w:w="6000"/>
+            <w:tcMar>
+              <w:top w:w="100" w:type="dxa"/>
+              <w:start w:w="120" w:type="dxa"/>
+              <w:bottom w:w="100" w:type="dxa"/>
+              <w:end w:w="120" w:type="dxa"/>
+            </w:tcMar>
+          </w:tcPr>
+          <w:p>
+            <w:pPr/>
+            <w:r>
+              <w:rPr/>
+              <w:t>Wallet Oracle reconstruída a partir de Base64</w:t>
+            </w:r>
+          </w:p>
+        </w:tc>
+        <w:tc>
+          <w:tcPr>
+            <w:tcW w:type="dxa" w:w="3360"/>
+            <w:tcMar>
+              <w:top w:w="100" w:type="dxa"/>
+              <w:start w:w="120" w:type="dxa"/>
+              <w:bottom w:w="100" w:type="dxa"/>
+              <w:end w:w="120" w:type="dxa"/>
+            </w:tcMar>
+          </w:tcPr>
+          <w:p>
+            <w:pPr/>
+            <w:r>
+              <w:rPr/>
+              <w:t>Aprovada</w:t>
+            </w:r>
+          </w:p>
+        </w:tc>
+      </w:tr>
+      <w:tr>
+        <w:tc>
+          <w:tcPr>
+            <w:tcW w:type="dxa" w:w="6000"/>
+            <w:tcMar>
+              <w:top w:w="100" w:type="dxa"/>
+              <w:start w:w="120" w:type="dxa"/>
+              <w:bottom w:w="100" w:type="dxa"/>
+              <w:end w:w="120" w:type="dxa"/>
+            </w:tcMar>
+          </w:tcPr>
+          <w:p>
+            <w:pPr/>
+            <w:r>
+              <w:rPr/>
+              <w:t>Deploy no Streamlit Community Cloud</w:t>
+            </w:r>
+          </w:p>
+        </w:tc>
+        <w:tc>
+          <w:tcPr>
+            <w:tcW w:type="dxa" w:w="3360"/>
+            <w:tcMar>
+              <w:top w:w="100" w:type="dxa"/>
+              <w:start w:w="120" w:type="dxa"/>
+              <w:bottom w:w="100" w:type="dxa"/>
+              <w:end w:w="120" w:type="dxa"/>
+            </w:tcMar>
+          </w:tcPr>
+          <w:p>
+            <w:pPr/>
+            <w:r>
+              <w:rPr/>
+              <w:t>Aprovado</w:t>
+            </w:r>
+          </w:p>
+        </w:tc>
+      </w:tr>
+      <w:tr>
+        <w:tc>
+          <w:tcPr>
+            <w:tcW w:type="dxa" w:w="6000"/>
+            <w:tcMar>
+              <w:top w:w="100" w:type="dxa"/>
+              <w:start w:w="120" w:type="dxa"/>
+              <w:bottom w:w="100" w:type="dxa"/>
+              <w:end w:w="120" w:type="dxa"/>
+            </w:tcMar>
+          </w:tcPr>
+          <w:p>
+            <w:pPr/>
+            <w:r>
+              <w:rPr/>
+              <w:t>Consulta ponta a ponta no ambiente hospedado</w:t>
+            </w:r>
+          </w:p>
+        </w:tc>
+        <w:tc>
+          <w:tcPr>
+            <w:tcW w:type="dxa" w:w="3360"/>
+            <w:tcMar>
+              <w:top w:w="100" w:type="dxa"/>
+              <w:start w:w="120" w:type="dxa"/>
+              <w:bottom w:w="100" w:type="dxa"/>
+              <w:end w:w="120" w:type="dxa"/>
+            </w:tcMar>
+          </w:tcPr>
+          <w:p>
+            <w:pPr/>
+            <w:r>
+              <w:rPr/>
+              <w:t>Aprovada — 2.896.345 internações</w:t>
+            </w:r>
+          </w:p>
+        </w:tc>
+      </w:tr>
     </w:tbl>
     <w:p>
       <w:pPr>
@@ -1305,12 +1617,47 @@
         <w:pStyle w:val="Heading1"/>
       </w:pPr>
       <w:r>
-        <w:t>8. Conclusão</w:t>
+        <w:t>8. Publicação e integração com o Power BI</w:t>
+      </w:r>
+    </w:p>
+    <w:p>
+      <w:pPr/>
+      <w:r>
+        <w:t>O dashboard Power BI, desenvolvido por Kaique, permanece como a camada de análise gerencial estruturada. A perspectiva de inteligência artificial foi publicada como aplicação web independente, consultando a mesma base Oracle e pronta para ser aberta a partir do dashboard por meio de um botão com ação Web URL.</w:t>
+      </w:r>
+    </w:p>
+    <w:p>
+      <w:pPr/>
+      <w:r>
+        <w:t xml:space="preserve">Endereço público do MVP: </w:t>
+      </w:r>
+      <w:hyperlink r:id="rId11">
+        <w:r>
+          <w:rPr>
+            <w:color w:val="0563C1"/>
+            <w:u w:val="single"/>
+          </w:rPr>
+          <w:t>https://hospintel-sp-ai.streamlit.app</w:t>
+        </w:r>
+      </w:hyperlink>
+    </w:p>
+    <w:p>
+      <w:pPr/>
+      <w:r>
+        <w:t>O teste final no ambiente hospedado confirmou o fluxo completo: pergunta em português, geração de SQL pelo Oracle Select AI com Cohere, validação local de somente leitura, execução nas views autorizadas e retorno de 2.896.345 internações para 2025.</w:t>
+      </w:r>
+    </w:p>
+    <w:p>
+      <w:pPr>
+        <w:pStyle w:val="Heading1"/>
+      </w:pPr>
+      <w:r>
+        <w:t>9. Conclusão</w:t>
       </w:r>
     </w:p>
     <w:p>
       <w:r>
-        <w:t>O trabalho resultou em um MVP integrado, reprodutível e seguro. O Power BI fornece a visão gerencial estruturada, enquanto o Streamlit com Oracle Select AI e Cohere permite a exploração dos mesmos dados por meio de perguntas em português. Essa combinação demonstra o potencial de integração entre dados públicos, banco de dados em nuvem, visualização analítica e inteligência artificial generativa.</w:t>
+        <w:t>O trabalho resultou em um MVP integrado, reprodutível, seguro e efetivamente publicado. O Power BI fornece a visão gerencial estruturada, enquanto o Streamlit com Oracle Select AI e Cohere permite a exploração dos mesmos dados por perguntas em português, com controles de acesso, auditoria do SQL e conexão segura ao Oracle.</w:t>
       </w:r>
     </w:p>
     <w:p>

</xml_diff>

<commit_message>
Atualizar relatório técnico com integração e perguntas
</commit_message>
<xml_diff>
--- a/docs/Relatorio_Tecnico_HospIntel_SP.docx
+++ b/docs/Relatorio_Tecnico_HospIntel_SP.docx
@@ -118,7 +118,7 @@
           </w:tcPr>
           <w:p>
             <w:r>
-              <w:t>DATASUS / SIH-SUS — internações por município, São Paulo, 2025</w:t>
+              <w:t>SIH/SUS 2025, CNES 2025 e estimativas populacionais IBGE 2025</w:t>
             </w:r>
           </w:p>
         </w:tc>
@@ -174,7 +174,7 @@
     </w:p>
     <w:p>
       <w:r>
-        <w:t>O HospIntel SP foi desenvolvido como um MVP para demonstrar como dados públicos de internações hospitalares podem ser organizados em uma base Oracle e consultados por duas interfaces complementares: um dashboard em Power BI e uma aplicação em Streamlit com perguntas em linguagem natural.</w:t>
+        <w:t>O HospIntel SP foi desenvolvido como um MVP de apoio à análise municipal da pressão assistencial em cinco municípios paulistas, sem perder a visão estadual das internações. A solução integra internações do SIH/SUS, capacidade hospitalar do CNES e população estimada pelo IBGE em uma base Oracle, consultada por duas interfaces complementares: dashboard em Power BI e aplicação Streamlit com Oracle Select AI.</w:t>
       </w:r>
     </w:p>
     <w:tbl>
@@ -340,7 +340,7 @@
           </w:tcPr>
           <w:p>
             <w:r>
-              <w:t>DATASUS / SIH-SUS</w:t>
+              <w:t>SIH/SUS, CNES e IBGE</w:t>
             </w:r>
           </w:p>
         </w:tc>
@@ -357,7 +357,7 @@
           </w:tcPr>
           <w:p>
             <w:r>
-              <w:t>Fonte pública das internações hospitalares por município e mês.</w:t>
+              <w:t>Internações mensais, capacidade hospitalar SUS e população estimada.</w:t>
             </w:r>
           </w:p>
         </w:tc>
@@ -413,7 +413,7 @@
           </w:tcPr>
           <w:p>
             <w:r>
-              <w:t>Limpeza, transformação, validação e geração do CSV em formato longo.</w:t>
+              <w:t>Limpeza e transformação do SIH/SUS, preparação do JSON CNES, validação e geração dos arquivos processados.</w:t>
             </w:r>
           </w:p>
         </w:tc>
@@ -882,7 +882,7 @@
     </w:p>
     <w:p>
       <w:r>
-        <w:t>A exportação do DATASUS foi preservada como fonte original. Um pipeline em Python transformou os dados para formato longo e verificou cobertura, totais e consistência.</w:t>
+        <w:t>A exportação do SIH/SUS foi preservada como fonte original. Um pipeline em Python transformou os dados para formato longo e verificou cobertura, totais e consistência. Para a camada municipal integrada, foram preparados também um documento JSON com hospitais e leitos do CNES e um CSV com as estimativas populacionais do IBGE para 1º de julho de 2025.</w:t>
       </w:r>
     </w:p>
     <w:p>
@@ -895,7 +895,7 @@
     </w:p>
     <w:p>
       <w:r>
-        <w:t>Foram carregadas 3.924 linhas, referentes a 327 municípios e 12 meses de 2025. A base totalizou 2.896.345 internações e originou três views analíticas autorizadas.</w:t>
+        <w:t>Foram carregadas 3.924 linhas do SIH/SUS, referentes a 327 municípios e 12 meses de 2025, totalizando 2.896.345 internações. O CNES foi armazenado como 298 documentos JSON e expandido para 3.475 registros hospital-mês e 60 registros município-mês. O CSV do IBGE foi acessado por Oracle External Table e integrado às internações e aos leitos na view VW_PRESSAO_ASSISTENCIAL_POPULACAO, com 60 linhas para cinco municípios e doze meses.</w:t>
       </w:r>
     </w:p>
     <w:p>
@@ -921,7 +921,7 @@
     </w:p>
     <w:p>
       <w:r>
-        <w:t>O perfil HOSPINTEL_AI foi configurado no esquema ADMIN com o provedor Cohere. Uma função com direitos do definidor expôs apenas a geração de SQL ao usuário restrito.</w:t>
+        <w:t>O perfil HOSPINTEL_AI foi configurado no esquema ADMIN com o provedor Cohere e metadados das quatro views autorizadas, incluindo VW_PRESSAO_ASSISTENCIAL_POPULACAO. Uma função com direitos do definidor expôs somente a geração de SQL ao usuário restrito.</w:t>
       </w:r>
     </w:p>
     <w:p>
@@ -947,7 +947,7 @@
     </w:p>
     <w:p>
       <w:r>
-        <w:t>Foram testados totais, rankings, filtros por município e mês, maior valor mensal, crescimento absoluto, redução absoluta e crescimento percentual.</w:t>
+        <w:t>Foram testados totais, rankings, filtros por município e mês, maior valor mensal, crescimento absoluto, redução absoluta e crescimento percentual. Também foram validadas consultas integradas: maior número de internações por leito SUS em janeiro de 2025 e comparação das internações por 100 mil habitantes no mesmo período.</w:t>
       </w:r>
     </w:p>
     <w:p>
@@ -978,7 +978,7 @@
         <w:ind w:left="288"/>
       </w:pPr>
       <w:r>
-        <w:t>DATASUS / SIH-SUS → transformação e validação em Python → Oracle Autonomous Database</w:t>
+        <w:t>SIH/SUS (CSV relacional) + CNES (JSON) + IBGE 2025 (CSV em Object Storage / External Table) → transformação, validação e integração → Oracle Autonomous Database</w:t>
       </w:r>
     </w:p>
     <w:p>
@@ -987,7 +987,7 @@
         <w:ind w:left="288"/>
       </w:pPr>
       <w:r>
-        <w:t>Oracle → views analíticas → Power BI</w:t>
+        <w:t>Oracle → views analíticas e view integrada municipal → Power BI</w:t>
       </w:r>
     </w:p>
     <w:p>
@@ -1052,7 +1052,7 @@
         <w:spacing w:after="80"/>
       </w:pPr>
       <w:r>
-        <w:t>Somente três views analíticas são autorizadas.</w:t>
+        <w:t>Somente quatro views analíticas são autorizadas, incluindo a view municipal integrada.</w:t>
       </w:r>
     </w:p>
     <w:p>
@@ -1593,23 +1593,235 @@
           </w:p>
         </w:tc>
       </w:tr>
+      <w:tr>
+        <w:tc>
+          <w:tcPr>
+            <w:tcW w:type="dxa" w:w="6000"/>
+          </w:tcPr>
+          <w:p>
+            <w:r>
+              <w:t>Documentos CNES carregados</w:t>
+            </w:r>
+          </w:p>
+        </w:tc>
+        <w:tc>
+          <w:tcPr>
+            <w:tcW w:type="dxa" w:w="3360"/>
+          </w:tcPr>
+          <w:p>
+            <w:r>
+              <w:t>298</w:t>
+            </w:r>
+          </w:p>
+        </w:tc>
+      </w:tr>
+      <w:tr>
+        <w:tc>
+          <w:tcPr>
+            <w:tcW w:type="dxa" w:w="6000"/>
+          </w:tcPr>
+          <w:p>
+            <w:r>
+              <w:t>Registros CNES hospital-mês</w:t>
+            </w:r>
+          </w:p>
+        </w:tc>
+        <w:tc>
+          <w:tcPr>
+            <w:tcW w:type="dxa" w:w="3360"/>
+          </w:tcPr>
+          <w:p>
+            <w:r>
+              <w:t>3.475</w:t>
+            </w:r>
+          </w:p>
+        </w:tc>
+      </w:tr>
+      <w:tr>
+        <w:tc>
+          <w:tcPr>
+            <w:tcW w:type="dxa" w:w="6000"/>
+          </w:tcPr>
+          <w:p>
+            <w:r>
+              <w:t>Registros de capacidade município-mês</w:t>
+            </w:r>
+          </w:p>
+        </w:tc>
+        <w:tc>
+          <w:tcPr>
+            <w:tcW w:type="dxa" w:w="3360"/>
+          </w:tcPr>
+          <w:p>
+            <w:r>
+              <w:t>60</w:t>
+            </w:r>
+          </w:p>
+        </w:tc>
+      </w:tr>
+      <w:tr>
+        <w:tc>
+          <w:tcPr>
+            <w:tcW w:type="dxa" w:w="6000"/>
+          </w:tcPr>
+          <w:p>
+            <w:r>
+              <w:t>Municípios na External Table IBGE</w:t>
+            </w:r>
+          </w:p>
+        </w:tc>
+        <w:tc>
+          <w:tcPr>
+            <w:tcW w:type="dxa" w:w="3360"/>
+          </w:tcPr>
+          <w:p>
+            <w:r>
+              <w:t>5</w:t>
+            </w:r>
+          </w:p>
+        </w:tc>
+      </w:tr>
+      <w:tr>
+        <w:tc>
+          <w:tcPr>
+            <w:tcW w:type="dxa" w:w="6000"/>
+          </w:tcPr>
+          <w:p>
+            <w:r>
+              <w:t>Linhas da view integrada</w:t>
+            </w:r>
+          </w:p>
+        </w:tc>
+        <w:tc>
+          <w:tcPr>
+            <w:tcW w:type="dxa" w:w="3360"/>
+          </w:tcPr>
+          <w:p>
+            <w:r>
+              <w:t>60</w:t>
+            </w:r>
+          </w:p>
+        </w:tc>
+      </w:tr>
+      <w:tr>
+        <w:tc>
+          <w:tcPr>
+            <w:tcW w:type="dxa" w:w="6000"/>
+          </w:tcPr>
+          <w:p>
+            <w:r>
+              <w:t>Consulta por leito SUS — jan./2025</w:t>
+            </w:r>
+          </w:p>
+        </w:tc>
+        <w:tc>
+          <w:tcPr>
+            <w:tcW w:type="dxa" w:w="3360"/>
+          </w:tcPr>
+          <w:p>
+            <w:r>
+              <w:t>Aprovada — Santo André: 5,3836</w:t>
+            </w:r>
+          </w:p>
+        </w:tc>
+      </w:tr>
+      <w:tr>
+        <w:tc>
+          <w:tcPr>
+            <w:tcW w:type="dxa" w:w="6000"/>
+          </w:tcPr>
+          <w:p>
+            <w:r>
+              <w:t>Consulta por 100 mil habitantes — jan./2025</w:t>
+            </w:r>
+          </w:p>
+        </w:tc>
+        <w:tc>
+          <w:tcPr>
+            <w:tcW w:type="dxa" w:w="3360"/>
+          </w:tcPr>
+          <w:p>
+            <w:r>
+              <w:t>Aprovada — 5 municípios</w:t>
+            </w:r>
+          </w:p>
+        </w:tc>
+      </w:tr>
     </w:tbl>
     <w:p>
       <w:pPr>
         <w:pStyle w:val="Heading1"/>
       </w:pPr>
       <w:r>
-        <w:t>7. Escopo e limitações</w:t>
+        <w:t>7. Perguntas alinhadas ao modelo</w:t>
       </w:r>
     </w:p>
     <w:p>
+      <w:pPr/>
       <w:r>
-        <w:t>O conjunto atual contém município, código do município, mês, ano e quantidade de internações. Por isso, o MVP responde adequadamente a perguntas sobre totais, evolução mensal, rankings e variações absolutas ou percentuais.</w:t>
+        <w:t>As perguntas abaixo correspondem à granularidade e aos indicadores efetivamente disponíveis. Elas servem como roteiro para demonstração, testes e atualização da apresentação da equipe.</w:t>
       </w:r>
     </w:p>
     <w:p>
+      <w:pPr>
+        <w:pStyle w:val="ListNumber"/>
+      </w:pPr>
       <w:r>
-        <w:t>Nesta versão, não estão disponíveis hospital ou unidade, número de leitos, permanência média, tipo de atendimento, região de saúde ou um indicador específico da Grande São Paulo. Perguntas que dependam desses elementos exigirão novas fontes de dados, novas colunas e atualização das views e do perfil Select AI.</w:t>
+        <w:t>Qual foi o total de internações nos municípios paulistas em 2025?</w:t>
+      </w:r>
+    </w:p>
+    <w:p>
+      <w:pPr>
+        <w:pStyle w:val="ListNumber"/>
+      </w:pPr>
+      <w:r>
+        <w:t>Quais foram os dez municípios com mais internações em 2025?</w:t>
+      </w:r>
+    </w:p>
+    <w:p>
+      <w:pPr>
+        <w:pStyle w:val="ListNumber"/>
+      </w:pPr>
+      <w:r>
+        <w:t>Quais dos cinco municípios analisados apresentaram maior crescimento percentual de internações entre novembro e dezembro de 2025?</w:t>
+      </w:r>
+    </w:p>
+    <w:p>
+      <w:pPr>
+        <w:pStyle w:val="ListNumber"/>
+      </w:pPr>
+      <w:r>
+        <w:t>Em janeiro de 2025, qual município teve mais internações por leito SUS?</w:t>
+      </w:r>
+    </w:p>
+    <w:p>
+      <w:pPr>
+        <w:pStyle w:val="ListNumber"/>
+      </w:pPr>
+      <w:r>
+        <w:t>Compare as internações por 100 mil habitantes dos cinco municípios em janeiro de 2025.</w:t>
+      </w:r>
+    </w:p>
+    <w:p>
+      <w:pPr>
+        <w:pStyle w:val="ListNumber"/>
+      </w:pPr>
+      <w:r>
+        <w:t>Considerando janeiro de 2025, quais municípios apresentaram maior pressão assistencial relativa, medida por internações por leito SUS e internações por 100 mil habitantes?</w:t>
+      </w:r>
+    </w:p>
+    <w:p>
+      <w:pPr>
+        <w:pStyle w:val="ListNumber"/>
+      </w:pPr>
+      <w:r>
+        <w:t>Compare internações e leitos SUS disponíveis por município em janeiro de 2025.</w:t>
+      </w:r>
+    </w:p>
+    <w:p>
+      <w:pPr/>
+      <w:r>
+        <w:t>Perguntas fora do escopo atual: permanência média por hospital; razão de internações por leito em cada hospital; tipos de atendimento; comparações por região de saúde; taxa de ocupação; e recomendações automáticas sobre onde expandir a rede.</w:t>
       </w:r>
     </w:p>
     <w:p>
@@ -1617,7 +1829,25 @@
         <w:pStyle w:val="Heading1"/>
       </w:pPr>
       <w:r>
-        <w:t>8. Publicação e integração com o Power BI</w:t>
+        <w:t>8. Escopo e limitações</w:t>
+      </w:r>
+    </w:p>
+    <w:p>
+      <w:r>
+        <w:t>O núcleo estadual contém município, código municipal, mês e quantidade de internações. A camada integrada concentra-se em cinco municípios — São Paulo, Guarulhos, Osasco, Santo André e São Bernardo do Campo — e acrescenta leitos SUS e população estimada de 2025. Assim, o MVP responde a totais, evolução mensal, rankings, variações entre períodos, internações por leito SUS e internações por 100 mil habitantes.</w:t>
+      </w:r>
+    </w:p>
+    <w:p>
+      <w:r>
+        <w:t>Nesta versão, não estão disponíveis internações individualizadas por hospital, permanência média, tipos de atendimento ou agregação por região de saúde. Por isso, o sistema não deve responder a rankings hospitalares, ocupação de leitos, permanência média ou recomendações prescritivas de expansão. O indicador internações por leito SUS é uma aproximação relativa de pressão de demanda e não representa taxa de ocupação.</w:t>
+      </w:r>
+    </w:p>
+    <w:p>
+      <w:pPr>
+        <w:pStyle w:val="Heading1"/>
+      </w:pPr>
+      <w:r>
+        <w:t>9. Publicação e integração com o Power BI</w:t>
       </w:r>
     </w:p>
     <w:p>
@@ -1644,7 +1874,7 @@
     <w:p>
       <w:pPr/>
       <w:r>
-        <w:t>O teste final no ambiente hospedado confirmou o fluxo completo: pergunta em português, geração de SQL pelo Oracle Select AI com Cohere, validação local de somente leitura, execução nas views autorizadas e retorno de 2.896.345 internações para 2025.</w:t>
+        <w:t>Os testes finais no ambiente hospedado confirmaram o fluxo completo: pergunta em português, geração de SQL pelo Oracle Select AI com Cohere, validação local de somente leitura, execução nas views autorizadas e apresentação do resultado com o SQL utilizado. Entre as evidências, Santo André apresentou 5,3836 internações por leito SUS em janeiro de 2025; na comparação por 100 mil habitantes, foram retornados os cinco municípios, liderados por Santo André (511,48) e São Paulo (509,01).</w:t>
       </w:r>
     </w:p>
     <w:p>
@@ -1652,12 +1882,12 @@
         <w:pStyle w:val="Heading1"/>
       </w:pPr>
       <w:r>
-        <w:t>9. Conclusão</w:t>
+        <w:t>10. Conclusão</w:t>
       </w:r>
     </w:p>
     <w:p>
       <w:r>
-        <w:t>O trabalho resultou em um MVP integrado, reprodutível, seguro e efetivamente publicado. O Power BI fornece a visão gerencial estruturada, enquanto o Streamlit com Oracle Select AI e Cohere permite a exploração dos mesmos dados por perguntas em português, com controles de acesso, auditoria do SQL e conexão segura ao Oracle.</w:t>
+        <w:t>O trabalho resultou em um MVP integrado, reprodutível, seguro e publicado. O Power BI fornece a análise gerencial estruturada, enquanto o Streamlit com Oracle Select AI permite explorar, em português, internações, capacidade SUS e população. O escopo municipal e as limitações estão declarados para evitar interpretações hospitalares ou o uso do indicador de pressão como taxa de ocupação.</w:t>
       </w:r>
     </w:p>
     <w:p>

</xml_diff>